<commit_message>
1016152: Fixed template issue
</commit_message>
<xml_diff>
--- a/Automated-Certificate-Creation/Automated-Certificate-Creation/wwwroot/Data/Template.docx
+++ b/Automated-Certificate-Creation/Automated-Certificate-Creation/wwwroot/Data/Template.docx
@@ -459,7 +459,25 @@
         <w:rPr>
           <w:rFonts w:asciiTheme="majorBidi" w:hAnsiTheme="majorBidi" w:cstheme="majorBidi"/>
         </w:rPr>
-        <w:t xml:space="preserve">Course Code: </w:t>
+        <w:t>Course Code</w:t>
+      </w:r>
+      <w:r>
+        <w:rPr>
+          <w:rFonts w:asciiTheme="majorBidi" w:hAnsiTheme="majorBidi" w:cstheme="majorBidi"/>
+        </w:rPr>
+        <w:tab/>
+      </w:r>
+      <w:r>
+        <w:rPr>
+          <w:rFonts w:asciiTheme="majorBidi" w:hAnsiTheme="majorBidi" w:cstheme="majorBidi"/>
+        </w:rPr>
+        <w:tab/>
+      </w:r>
+      <w:r>
+        <w:rPr>
+          <w:rFonts w:asciiTheme="majorBidi" w:hAnsiTheme="majorBidi" w:cstheme="majorBidi"/>
+        </w:rPr>
+        <w:t xml:space="preserve">: </w:t>
       </w:r>
       <w:r>
         <w:rPr>
@@ -505,7 +523,25 @@
         <w:rPr>
           <w:rFonts w:asciiTheme="majorBidi" w:hAnsiTheme="majorBidi" w:cstheme="majorBidi"/>
         </w:rPr>
-        <w:t xml:space="preserve">Department: </w:t>
+        <w:t>Department</w:t>
+      </w:r>
+      <w:r>
+        <w:rPr>
+          <w:rFonts w:asciiTheme="majorBidi" w:hAnsiTheme="majorBidi" w:cstheme="majorBidi"/>
+        </w:rPr>
+        <w:tab/>
+      </w:r>
+      <w:r>
+        <w:rPr>
+          <w:rFonts w:asciiTheme="majorBidi" w:hAnsiTheme="majorBidi" w:cstheme="majorBidi"/>
+        </w:rPr>
+        <w:tab/>
+      </w:r>
+      <w:r>
+        <w:rPr>
+          <w:rFonts w:asciiTheme="majorBidi" w:hAnsiTheme="majorBidi" w:cstheme="majorBidi"/>
+        </w:rPr>
+        <w:t xml:space="preserve">: </w:t>
       </w:r>
       <w:r>
         <w:rPr>

</xml_diff>